<commit_message>
Docs: generated README/PROJECTS_SUMMARY/DESIGN and registry no longer call the two fix branches unpushed; refresh test counts
Co-Authored-By: Claude Sonnet 5.5 <noreply@anthropic.com>
</commit_message>
<xml_diff>
--- a/PROJECTS_SUMMARY.docx
+++ b/PROJECTS_SUMMARY.docx
@@ -854,7 +854,7 @@
         <w:t>2026-09-05 → 09-26 (~23 commits, all for the Ft Polk Complex A program).</w:t>
       </w:r>
       <w:r>
-        <w:t xml:space="preserve"> Merged to main: the backup parser reads NiagaraHistoryImport descriptors into Jace.history_imports and uses them to decide trended-ness; PointSpec gains history_id and remote_slot_path; classifier fixes for hydronic temps, outdoor, wet-bulb, token-bounded pumps, FC_ fan coils and specific CHW/HW valve and cool/heat setpoint roles; per-sample quality, timestamp_source, provenance, raw_value and gap qualities on the model; and a new history_csv module — a lossless per-point CSV writer/reader with strict atomic validation and an exported HistoryLookup type — which is now the bridge format between niagara-llm's export-history and digital-twin's publisher-mode replay. Merged into local main on 09-26 and pushed 09-28 (origin/main = f944f82; the polk-mold-risk branch is gone): a DEWPOINT role, a DEHUM status/command rule and CURRENT/ampere classification. niagara-llm takes niagara-config as an editable ../niagara-config path dependency, so local runs import whatever is checked out — currently branch fix/return-air-camelcase (one unpushed commit classifying camelCase ReturnAirTemp, 339 tests collected), while niagara-llm's release manifest pins f944f82. A pre-existing HistoryImport draft still sits unapplied in stash@{0}. 323 tests collected on main.</w:t>
+        <w:t xml:space="preserve"> Merged to main: the backup parser reads NiagaraHistoryImport descriptors into Jace.history_imports and uses them to decide trended-ness; PointSpec gains history_id and remote_slot_path; classifier fixes for hydronic temps, outdoor, wet-bulb, token-bounded pumps, FC_ fan coils and specific CHW/HW valve and cool/heat setpoint roles; per-sample quality, timestamp_source, provenance, raw_value and gap qualities on the model; and a new history_csv module — a lossless per-point CSV writer/reader with strict atomic validation and an exported HistoryLookup type — which is now the bridge format between niagara-llm's export-history and digital-twin's publisher-mode replay. Merged into local main on 09-26 and pushed 09-28 (origin/main = f944f82; the polk-mold-risk branch is gone): a DEWPOINT role, a DEHUM status/command rule and CURRENT/ampere classification. niagara-llm takes niagara-config as an editable ../niagara-config path dependency, so local runs import whatever is checked out — currently main at 55f7417 (which adds the camelCase ReturnAirTemp classifier fix, niagara-config PR 2, merged 09-29; 339 tests collected), while niagara-llm's release manifest pins f944f82. A pre-existing HistoryImport draft still sits unapplied in stash@{0}. 339 tests collected on main.</w:t>
       </w:r>
     </w:p>
     <w:p>
@@ -990,7 +990,7 @@
         <w:t>09-28:</w:t>
       </w:r>
       <w:r>
-        <w:t xml:space="preserve"> the long-uncommitted 09-05 review-improvements working tree was rebased onto main and pushed as 7cb3d54 — bounded background workers for notifications and LLM diagnosis, detector health tracking, per-point actuation write policies (units, bounds, max change, max age, readback tolerance) with verified readback and caller identity on every audited write, a /readiness route and read-only pilot command, a probe-obix station probe, and release packaging with a release-manifest.json pinning niagara-config at f944f82; the primary checkout is back on main, clean. A follow-up on branch fix/fpt-first-write-restore (unpushed) stops a failing audit sink from hiding an actuator write that already landed. </w:t>
+        <w:t xml:space="preserve"> the long-uncommitted 09-05 review-improvements working tree was rebased onto main and pushed as 7cb3d54 — bounded background workers for notifications and LLM diagnosis, detector health tracking, per-point actuation write policies (units, bounds, max change, max age, readback tolerance) with verified readback and caller identity on every audited write, a /readiness route and read-only pilot command, a probe-obix station probe, and release packaging with a release-manifest.json pinning niagara-config at f944f82; the primary checkout is back on main, clean. A follow-up, merged 09-29 as niagara-llm PR 4 (ce78634), stops a failing audit sink from hiding an actuator write that already landed. </w:t>
       </w:r>
       <w:r>
         <w:rPr>
@@ -999,7 +999,7 @@
         <w:t>Phase 7 Mold Risk Index</w:t>
       </w:r>
       <w:r>
-        <w:t xml:space="preserve"> (spec Phases 6–8) was built the same night on branch polk-mold-risk-index in the ~/dev/niagara-llm-mold-risk-index worktree, merged into main and pushed on 09-29 (origin/main 33e6eec): an hour-grid with sensor validity, building/cell/plant bindings, RH, DOAS-not-drying, CHW-warm-under-latent-load and pressurization components, a score with confidence, an assess-backup report section and a Mold Risk workbook sheet, followed by ten manual Codex review passes; </w:t>
+        <w:t xml:space="preserve"> (spec Phases 6–8) was built the same night on branch polk-mold-risk-index in a linked worktree (since removed), merged into main and pushed on 09-29 (origin/main 33e6eec): an hour-grid with sensor validity, building/cell/plant bindings, RH, DOAS-not-drying, CHW-warm-under-latent-load and pressurization components, a score with confidence, an assess-backup report section and a Mold Risk workbook sheet, followed by ten manual Codex review passes; </w:t>
       </w:r>
       <w:r>
         <w:rPr>
@@ -1008,7 +1008,7 @@
         <w:t>Phase 8's virtual-RH surrogate stopped at its own go/no-go</w:t>
       </w:r>
       <w:r>
-        <w:t xml:space="preserve"> (a linear surrogate passed the accuracy gate for only 11–15 % of building 1949's rooms against a required 70 %), so nothing was built for it. Tests: 2,272 passed / 15 skipped on main plus 13 browser tests; version still 0.1.0.</w:t>
+        <w:t xml:space="preserve"> (a linear surrogate passed the accuracy gate for only 11–15 % of building 1949's rooms against a required 70 %), so nothing was built for it. Tests: 2,278 passed / 15 skipped on main plus 13 browser tests; version still 0.1.0.</w:t>
       </w:r>
     </w:p>
     <w:p>

</xml_diff>